<commit_message>
Living change records: round-5 entries (pausable clock, seamless recovery, launcher)
https://claude.ai/code/session_01JbfZmzoHzkF8tUdxhNPCER
</commit_message>
<xml_diff>
--- a/Brief_Change_Record.docx
+++ b/Brief_Change_Record.docx
@@ -421,16 +421,21 @@
         <w:t>Cross-device resume</w:t>
       </w:r>
       <w:r>
-        <w:t xml:space="preserve"> (researcher tool): any session can be continued from the admin dashboard via a resume link; the run is rebuilt from the database on any device and an interrupted role-play is replayed into the model so the future self keeps its memory. </w:t>
+        <w:t xml:space="preserve"> (researcher tool): any session can be continued from the admin dashboard via a resume link; the run is rebuilt from the database on any device and an interrupted role-play is replayed into the model so the future self keeps its memory.</w:t>
+      </w:r>
+    </w:p>
+    <w:p>
+      <w:pPr>
+        <w:pStyle w:val="ListBullet"/>
+      </w:pPr>
+      <w:r>
+        <w:rPr>
+          <w:b/>
+        </w:rPr>
+        <w:t>Conversation-time measurement changed</w:t>
       </w:r>
       <w:r>
-        <w:rPr>
-          <w:i/>
-        </w:rPr>
-        <w:t>Analysis note:</w:t>
-      </w:r>
-      <w:r>
-        <w:t xml:space="preserve"> resumed runs restart </w:t>
+        <w:t xml:space="preserve"> (2026-06-11 late): </w:t>
       </w:r>
       <w:r>
         <w:rPr>
@@ -441,7 +446,18 @@
         <w:t>durationSec</w:t>
       </w:r>
       <w:r>
-        <w:t xml:space="preserve"> at the resume point; </w:t>
+        <w:t xml:space="preserve"> is now ACCUMULATED LIVE TIME — the stage-C clock pauses while the page is hidden or closed, while a connection problem blocks replies, and at the hard cap, and it continues from the saved value on every resume (same device or another). Interruptions no longer consume the participant's 20/30-minute policy window, and </w:t>
+      </w:r>
+      <w:r>
+        <w:rPr>
+          <w:rFonts w:ascii="Consolas" w:hAnsi="Consolas"/>
+          <w:color w:val="7A3318"/>
+          <w:sz w:val="19"/>
+        </w:rPr>
+        <w:t>durationSec</w:t>
+      </w:r>
+      <w:r>
+        <w:t xml:space="preserve"> measures actual conversation exposure rather than wall time. </w:t>
       </w:r>
       <w:r>
         <w:rPr>
@@ -452,7 +468,35 @@
         <w:t>turnCount</w:t>
       </w:r>
       <w:r>
-        <w:t xml:space="preserve"> is cumulative; transcripts are cumulative.</w:t>
+        <w:t xml:space="preserve"> and transcripts are cumulative across resumes. Update the v4.2 measure definitions accordingly.</w:t>
+      </w:r>
+    </w:p>
+    <w:p>
+      <w:pPr>
+        <w:pStyle w:val="ListBullet"/>
+      </w:pPr>
+      <w:r>
+        <w:rPr>
+          <w:b/>
+        </w:rPr>
+        <w:t>Interruption robustness</w:t>
+      </w:r>
+      <w:r>
+        <w:t>: a server restart/redeploy mid-conversation no longer breaks or resets anything — the chat silently rebuilds the model session from the saved transcript (full memory, no greeting) and continues; the same self-healing covers the post-survey free continuation (the "This chat has ended" dead-end is gone). Exposure integrity preserved across infrastructure events.</w:t>
+      </w:r>
+    </w:p>
+    <w:p>
+      <w:pPr>
+        <w:pStyle w:val="ListBullet"/>
+      </w:pPr>
+      <w:r>
+        <w:rPr>
+          <w:b/>
+        </w:rPr>
+        <w:t>Fielding workflow</w:t>
+      </w:r>
+      <w:r>
+        <w:t>: the admin dashboard gained a Launcher — choose the chatbot version (study cell), mint N personal links with sequential participant IDs in one click, copy the list, send one link per participant.</w:t>
       </w:r>
     </w:p>
     <w:p>

</xml_diff>

<commit_message>
Living change records: round-8 entries (card extraction, money rule, preview placeholder)
https://claude.ai/code/session_01JbfZmzoHzkF8tUdxhNPCER
</commit_message>
<xml_diff>
--- a/Brief_Change_Record.docx
+++ b/Brief_Change_Record.docx
@@ -323,6 +323,32 @@
       </w:r>
       <w:r>
         <w:t>) but is never part of the main analysis; exploration role-plays run the full main prompt with no time policy. The feature is announced on the landing "How it works" modal and the pre-post-survey pause. Rationale: participant value (free exploration as a thank-you) without touching the measured flow — all instruments are completed before the hub is reachable.</w:t>
+      </w:r>
+    </w:p>
+    <w:p>
+      <w:pPr>
+        <w:pStyle w:val="Heading2"/>
+      </w:pPr>
+      <w:r>
+        <w:t>1.8 Concrete money answers (both arms, 2026-06-12)</w:t>
+      </w:r>
+    </w:p>
+    <w:p>
+      <w:r>
+        <w:t>When pay comes up in the stage-C role-play, both arms now answer with concrete, location-based salary ranges expressed in today's terms and local currency at the relevant career stages (entry / mid / the future self's level), instead of vague "it varies" hedging. Realism-floor logic again: honest specificity applied symmetrically, neither inflating nor dramatising. Live-verified.</w:t>
+      </w:r>
+    </w:p>
+    <w:p>
+      <w:pPr>
+        <w:pStyle w:val="Heading2"/>
+      </w:pPr>
+      <w:r>
+        <w:t>1.9 Stage-B card rendering hardened (2026-06-12)</w:t>
+      </w:r>
+    </w:p>
+    <w:p>
+      <w:r>
+        <w:t>The five recommendation cards are parsed from the model's structured block; the parser previously demanded an exactly-formatted block, and any drift dumped raw JSON into the participant-visible chat (observed once with the reflective prompt on gpt-5.1). The extractor is now drift-tolerant (unclosed/missing fences, smart quotes, surrounding prose) with regression tests, so the card UI — part of the shared stage-B stimulus — renders reliably in all three rec variants.</w:t>
       </w:r>
     </w:p>
     <w:p>

</xml_diff>

<commit_message>
Change records: Round 10 — measurement restructure (FSCS restored, CIP-LR distal, video removed, hold/lock-in UI)
Record the 2026-06-17 changes (commit 2f4beac): FSCS continuity restored (H3
measurable again); CDSE-SA + CIP-CCA replaced by the CIP-Short Lack of Readiness
subscale (reverse-scored) with a [VERIFY] wording flag; the optional day-in-life
video subsystem removed; the imagination-page hold made skippable; the Phase B
career lock-in moved to a separate full-screen page. Updated both .md sources and
the .docx (Build Plan Round 10, Brief §7).

https://claude.ai/code/session_01R4Y7QpEyP79hJdnUsCSFUb
</commit_message>
<xml_diff>
--- a/Brief_Change_Record.docx
+++ b/Brief_Change_Record.docx
@@ -852,6 +852,158 @@
     </w:p>
     <w:p>
       <w:pPr>
+        <w:pStyle w:val="Heading1"/>
+      </w:pPr>
+      <w:r>
+        <w:t>7. Measurement restructure (2026-06-17, Kangzhi) — supersedes parts of §6</w:t>
+      </w:r>
+    </w:p>
+    <w:p>
+      <w:pPr/>
+      <w:r>
+        <w:t>Kangzhi's decisions after reviewing §6. Implemented on `main` (commit `2f4beac`).</w:t>
+      </w:r>
+    </w:p>
+    <w:p>
+      <w:pPr>
+        <w:pStyle w:val="Heading2"/>
+      </w:pPr>
+      <w:r>
+        <w:t>7.1 Continuity (FSCS) restored — resolves the §6.1 flag</w:t>
+      </w:r>
+    </w:p>
+    <w:p>
+      <w:pPr/>
+      <w:r>
+        <w:t>The 2-item pictorial FSCS continuity measure is reinstated (pre + post; continuity = mean of similarity + connectedness). Continuity is one of the three mediators (H3) and the channel the biographical-grounding component targets; its 14 Jun removal is reversed. The three mediators are again each measured: closeness (IOS, 1 item), continuity (FSCS, 2 items), vividness (4 items).</w:t>
+      </w:r>
+    </w:p>
+    <w:p>
+      <w:pPr>
+        <w:pStyle w:val="Heading2"/>
+      </w:pPr>
+      <w:r>
+        <w:t>7.2 Distal outcome changed — now CIP-Short "Lack of Readiness" only [VERIFY]</w:t>
+      </w:r>
+    </w:p>
+    <w:p>
+      <w:pPr/>
+      <w:r>
+        <w:t xml:space="preserve">The two former distal outcomes — CDSE-SA (career decision self-efficacy) and CIP-CCA (choice/commitment anxiety) — are removed. The single distal outcome is now the </w:t>
+      </w:r>
+      <w:r>
+        <w:rPr>
+          <w:b/>
+        </w:rPr>
+        <w:t>CIP-Short Lack of Readiness</w:t>
+      </w:r>
+      <w:r>
+        <w:t xml:space="preserve"> subscale (5 items, 6-point, reverse-scored; higher = more lack of readiness), pre + post. Method consequences to fold into Brief v4.2: update §2.5 (measures), §2.6 (H4/H5 now concern lack of readiness, not self-efficacy / choice anxiety), §4.1 (analysis), and Appendix F. </w:t>
+      </w:r>
+      <w:r>
+        <w:rPr>
+          <w:b/>
+        </w:rPr>
+        <w:t>[VERIFY]</w:t>
+      </w:r>
+      <w:r>
+        <w:t xml:space="preserve"> the verbatim item wording against Xu &amp; Tracey (2017b), J. Counseling Psychology 64, 222–232, before fielding — the uploaded CIP-Short paper (Xu 2020) gives only abbreviated Table-4 stems, which the app renders as full items pending confirmation. (Andrea's reserved, disabled post-survey placeholder still names her own CDSE-SF DV — left untouched.)</w:t>
+      </w:r>
+    </w:p>
+    <w:p>
+      <w:pPr>
+        <w:pStyle w:val="Heading2"/>
+      </w:pPr>
+      <w:r>
+        <w:t>7.3 Imagination hold removed (skippable) — supersedes §6.2</w:t>
+      </w:r>
+    </w:p>
+    <w:p>
+      <w:pPr/>
+      <w:r>
+        <w:t>The 20-second forced hold before the closeness measure is removed; the "Picture that future you" page is now skippable (the imagination prompt itself remains, optional). No forced pre-measure reactivity.</w:t>
+      </w:r>
+    </w:p>
+    <w:p>
+      <w:pPr>
+        <w:pStyle w:val="Heading2"/>
+      </w:pPr>
+      <w:r>
+        <w:t>7.4 "Day in the life" video removed — supersedes §6.3</w:t>
+      </w:r>
+    </w:p>
+    <w:p>
+      <w:pPr/>
+      <w:r>
+        <w:t>The optional Phase B→C video stimulus is deleted entirely. There is no pre-chat video exposure between phases, so the protocol-change / confound concern raised in §6.3 is moot.</w:t>
+      </w:r>
+    </w:p>
+    <w:p>
+      <w:pPr>
+        <w:pStyle w:val="Heading2"/>
+      </w:pPr>
+      <w:r>
+        <w:t>7.5 Phase B lock-in UX (no measurement change)</w:t>
+      </w:r>
+    </w:p>
+    <w:p>
+      <w:pPr/>
+      <w:r>
+        <w:t>The career lock-in is now a separate full-screen page with a "back to chat" button rather than an inline panel under the conversation. Participant-experience only.</w:t>
+      </w:r>
+    </w:p>
+    <w:p>
+      <w:pPr>
+        <w:pStyle w:val="Heading2"/>
+      </w:pPr>
+      <w:r>
+        <w:t>3 (amended) — measurement battery as of 2026-06-17</w:t>
+      </w:r>
+    </w:p>
+    <w:p>
+      <w:pPr/>
+      <w:r>
+        <w:t xml:space="preserve">The instrument list is now: TIPI-10, O*NET Work Values, RIASEC, </w:t>
+      </w:r>
+      <w:r>
+        <w:rPr>
+          <w:b/>
+        </w:rPr>
+        <w:t>IOS (closeness)</w:t>
+      </w:r>
+      <w:r>
+        <w:t xml:space="preserve">, </w:t>
+      </w:r>
+      <w:r>
+        <w:rPr>
+          <w:b/>
+        </w:rPr>
+        <w:t>FSCS-2 (continuity, restored)</w:t>
+      </w:r>
+      <w:r>
+        <w:t xml:space="preserve">, </w:t>
+      </w:r>
+      <w:r>
+        <w:rPr>
+          <w:b/>
+        </w:rPr>
+        <w:t>vividness ×4</w:t>
+      </w:r>
+      <w:r>
+        <w:t xml:space="preserve">, manipulation checks ×3, open-ended ×2, and </w:t>
+      </w:r>
+      <w:r>
+        <w:rPr>
+          <w:b/>
+        </w:rPr>
+        <w:t>CIP-Short Lack of Readiness (distal outcome, replaces CDSE-SA + CIP-CCA)</w:t>
+      </w:r>
+      <w:r>
+        <w:t>. CIP-CCA placeholders and the CDSE-SA verification task in §6/earlier are no longer applicable.</w:t>
+      </w:r>
+    </w:p>
+    <w:p>
+      <w:pPr>
         <w:jc w:val="center"/>
       </w:pPr>
       <w:r>

</xml_diff>